<commit_message>
Shorten bug report lines and tighten test plan for printing
Co-Authored-By: Claude Opus 5 <noreply@anthropic.com>
</commit_message>
<xml_diff>
--- a/qa/Class-Movie-Night-QA-Test-Plan.docx
+++ b/qa/Class-Movie-Night-QA-Test-Plan.docx
@@ -12,7 +12,7 @@
     </w:p>
     <w:p>
       <w:pPr>
-        <w:spacing w:after="200"/>
+        <w:spacing w:after="80"/>
       </w:pPr>
       <w:r>
         <w:rPr>
@@ -65,7 +65,7 @@
       <w:pPr>
         <w:pStyle w:val="Heading2"/>
         <w:keepNext/>
-        <w:spacing w:before="400"/>
+        <w:spacing w:before="200"/>
         <w:pBdr>
           <w:bottom w:val="single" w:sz="12" w:space="4" w:color="5538C9"/>
         </w:pBdr>
@@ -77,7 +77,7 @@
     <w:p>
       <w:pPr>
         <w:keepNext/>
-        <w:spacing w:before="120" w:after="40"/>
+        <w:spacing w:before="60" w:after="20"/>
       </w:pPr>
       <w:r>
         <w:rPr>
@@ -95,7 +95,7 @@
         </w:numPr>
         <w:pStyle w:val="ListNumber"/>
         <w:keepNext/>
-        <w:spacing w:after="40"/>
+        <w:spacing w:after="0"/>
       </w:pPr>
       <w:r>
         <w:t>Open the site.</w:t>
@@ -109,7 +109,7 @@
         </w:numPr>
         <w:pStyle w:val="ListNumber"/>
         <w:keepNext/>
-        <w:spacing w:after="40"/>
+        <w:spacing w:after="0"/>
       </w:pPr>
       <w:r>
         <w:t>Read the Home page.</w:t>
@@ -123,7 +123,7 @@
         </w:numPr>
         <w:pStyle w:val="ListNumber"/>
         <w:keepNext/>
-        <w:spacing w:after="40"/>
+        <w:spacing w:after="0"/>
       </w:pPr>
       <w:r>
         <w:t>Choose Alex from the name list.</w:t>
@@ -137,7 +137,7 @@
         </w:numPr>
         <w:pStyle w:val="ListNumber"/>
         <w:keepNext/>
-        <w:spacing w:after="40"/>
+        <w:spacing w:after="0"/>
       </w:pPr>
       <w:r>
         <w:t>Press Start reviewing movies.</w:t>
@@ -146,7 +146,7 @@
     <w:p>
       <w:pPr>
         <w:keepNext/>
-        <w:spacing w:before="120" w:after="40"/>
+        <w:spacing w:before="60" w:after="20"/>
       </w:pPr>
       <w:r>
         <w:rPr>
@@ -160,7 +160,7 @@
       <w:pPr>
         <w:pStyle w:val="ListBullet"/>
         <w:keepNext/>
-        <w:spacing w:after="40"/>
+        <w:spacing w:after="0"/>
       </w:pPr>
       <w:r>
         <w:t>The title “Class Movie Night” is shown with a short explanation of voting.</w:t>
@@ -170,7 +170,7 @@
       <w:pPr>
         <w:pStyle w:val="ListBullet"/>
         <w:keepNext/>
-        <w:spacing w:after="40"/>
+        <w:spacing w:after="0"/>
       </w:pPr>
       <w:r>
         <w:t>The page clearly shows that voting is open.</w:t>
@@ -180,7 +180,7 @@
       <w:pPr>
         <w:pStyle w:val="ListBullet"/>
         <w:keepNext/>
-        <w:spacing w:after="40"/>
+        <w:spacing w:after="0"/>
       </w:pPr>
       <w:r>
         <w:t>After choosing Alex, a greeting with Alex’s name appears.</w:t>
@@ -190,7 +190,7 @@
       <w:pPr>
         <w:pStyle w:val="ListBullet"/>
         <w:keepNext/>
-        <w:spacing w:after="40"/>
+        <w:spacing w:after="0"/>
       </w:pPr>
       <w:r>
         <w:t>Pressing the button opens the Movies tab.</w:t>
@@ -199,7 +199,7 @@
     <w:p>
       <w:pPr>
         <w:keepNext/>
-        <w:spacing w:before="160" w:after="120"/>
+        <w:spacing w:before="80" w:after="40"/>
       </w:pPr>
       <w:r>
         <w:rPr>
@@ -230,7 +230,7 @@
     <w:p>
       <w:pPr>
         <w:keepNext/>
-        <w:spacing w:after="0" w:before="160"/>
+        <w:spacing w:after="0" w:before="120"/>
         <w:tabs>
           <w:tab w:val="right" w:leader="underscore" w:pos="9648"/>
         </w:tabs>
@@ -241,8 +241,8 @@
     </w:p>
     <w:p>
       <w:pPr>
-        <w:keepNext/>
-        <w:spacing w:after="0" w:before="160"/>
+        <w:keepNext w:val="0"/>
+        <w:spacing w:after="0" w:before="120"/>
         <w:tabs>
           <w:tab w:val="right" w:leader="underscore" w:pos="9648"/>
         </w:tabs>
@@ -253,21 +253,9 @@
     </w:p>
     <w:p>
       <w:pPr>
-        <w:keepNext w:val="0"/>
-        <w:spacing w:after="0" w:before="160"/>
-        <w:tabs>
-          <w:tab w:val="right" w:leader="underscore" w:pos="9648"/>
-        </w:tabs>
-      </w:pPr>
-      <w:r>
-        <w:tab/>
-      </w:r>
-    </w:p>
-    <w:p>
-      <w:pPr>
         <w:pStyle w:val="Heading2"/>
         <w:keepNext/>
-        <w:spacing w:before="400"/>
+        <w:spacing w:before="200"/>
         <w:pBdr>
           <w:bottom w:val="single" w:sz="12" w:space="4" w:color="5538C9"/>
         </w:pBdr>
@@ -279,7 +267,7 @@
     <w:p>
       <w:pPr>
         <w:keepNext/>
-        <w:spacing w:before="120" w:after="40"/>
+        <w:spacing w:before="60" w:after="20"/>
       </w:pPr>
       <w:r>
         <w:rPr>
@@ -297,7 +285,7 @@
         </w:numPr>
         <w:pStyle w:val="ListNumber"/>
         <w:keepNext/>
-        <w:spacing w:after="40"/>
+        <w:spacing w:after="0"/>
       </w:pPr>
       <w:r>
         <w:t>On the Movies tab, look at every movie card.</w:t>
@@ -306,7 +294,7 @@
     <w:p>
       <w:pPr>
         <w:keepNext/>
-        <w:spacing w:before="120" w:after="40"/>
+        <w:spacing w:before="60" w:after="20"/>
       </w:pPr>
       <w:r>
         <w:rPr>
@@ -320,7 +308,7 @@
       <w:pPr>
         <w:pStyle w:val="ListBullet"/>
         <w:keepNext/>
-        <w:spacing w:after="40"/>
+        <w:spacing w:after="0"/>
       </w:pPr>
       <w:r>
         <w:t>Six movies are shown: Galaxy Explorers, The Secret Treehouse, Robo-Dog Returns, Mystery at Moon Lake, The Last Dragon Egg, Champions of Tomorrow.</w:t>
@@ -330,7 +318,7 @@
       <w:pPr>
         <w:pStyle w:val="ListBullet"/>
         <w:keepNext/>
-        <w:spacing w:after="40"/>
+        <w:spacing w:after="0"/>
       </w:pPr>
       <w:r>
         <w:t>Each card shows a title, genre, rating, runtime, description, a picture or placeholder, and a vote button.</w:t>
@@ -339,7 +327,7 @@
     <w:p>
       <w:pPr>
         <w:keepNext/>
-        <w:spacing w:before="160" w:after="120"/>
+        <w:spacing w:before="80" w:after="40"/>
       </w:pPr>
       <w:r>
         <w:rPr>
@@ -370,7 +358,7 @@
     <w:p>
       <w:pPr>
         <w:keepNext/>
-        <w:spacing w:after="0" w:before="160"/>
+        <w:spacing w:after="0" w:before="120"/>
         <w:tabs>
           <w:tab w:val="right" w:leader="underscore" w:pos="9648"/>
         </w:tabs>
@@ -381,8 +369,8 @@
     </w:p>
     <w:p>
       <w:pPr>
-        <w:keepNext/>
-        <w:spacing w:after="0" w:before="160"/>
+        <w:keepNext w:val="0"/>
+        <w:spacing w:after="0" w:before="120"/>
         <w:tabs>
           <w:tab w:val="right" w:leader="underscore" w:pos="9648"/>
         </w:tabs>
@@ -393,21 +381,9 @@
     </w:p>
     <w:p>
       <w:pPr>
-        <w:keepNext w:val="0"/>
-        <w:spacing w:after="0" w:before="160"/>
-        <w:tabs>
-          <w:tab w:val="right" w:leader="underscore" w:pos="9648"/>
-        </w:tabs>
-      </w:pPr>
-      <w:r>
-        <w:tab/>
-      </w:r>
-    </w:p>
-    <w:p>
-      <w:pPr>
         <w:pStyle w:val="Heading2"/>
         <w:keepNext/>
-        <w:spacing w:before="400"/>
+        <w:spacing w:before="200"/>
         <w:pBdr>
           <w:bottom w:val="single" w:sz="12" w:space="4" w:color="5538C9"/>
         </w:pBdr>
@@ -419,7 +395,7 @@
     <w:p>
       <w:pPr>
         <w:keepNext/>
-        <w:spacing w:before="120" w:after="40"/>
+        <w:spacing w:before="60" w:after="20"/>
       </w:pPr>
       <w:r>
         <w:rPr>
@@ -437,7 +413,7 @@
         </w:numPr>
         <w:pStyle w:val="ListNumber"/>
         <w:keepNext/>
-        <w:spacing w:after="40"/>
+        <w:spacing w:after="0"/>
       </w:pPr>
       <w:r>
         <w:t>On the Movies tab, press each genre filter button one at a time: Science Fiction, Adventure, Comedy, Mystery, Fantasy, Sports.</w:t>
@@ -451,7 +427,7 @@
         </w:numPr>
         <w:pStyle w:val="ListNumber"/>
         <w:keepNext/>
-        <w:spacing w:after="40"/>
+        <w:spacing w:after="0"/>
       </w:pPr>
       <w:r>
         <w:t>Press All.</w:t>
@@ -460,7 +436,7 @@
     <w:p>
       <w:pPr>
         <w:keepNext/>
-        <w:spacing w:before="120" w:after="40"/>
+        <w:spacing w:before="60" w:after="20"/>
       </w:pPr>
       <w:r>
         <w:rPr>
@@ -474,7 +450,7 @@
       <w:pPr>
         <w:pStyle w:val="ListBullet"/>
         <w:keepNext/>
-        <w:spacing w:after="40"/>
+        <w:spacing w:after="0"/>
       </w:pPr>
       <w:r>
         <w:t>Each genre button shows exactly one movie, the one with that genre.</w:t>
@@ -484,7 +460,7 @@
       <w:pPr>
         <w:pStyle w:val="ListBullet"/>
         <w:keepNext/>
-        <w:spacing w:after="40"/>
+        <w:spacing w:after="0"/>
       </w:pPr>
       <w:r>
         <w:t>All shows all six movies again.</w:t>
@@ -493,7 +469,7 @@
     <w:p>
       <w:pPr>
         <w:keepNext/>
-        <w:spacing w:before="160" w:after="120"/>
+        <w:spacing w:before="80" w:after="40"/>
       </w:pPr>
       <w:r>
         <w:rPr>
@@ -524,7 +500,7 @@
     <w:p>
       <w:pPr>
         <w:keepNext/>
-        <w:spacing w:after="0" w:before="160"/>
+        <w:spacing w:after="0" w:before="120"/>
         <w:tabs>
           <w:tab w:val="right" w:leader="underscore" w:pos="9648"/>
         </w:tabs>
@@ -535,8 +511,8 @@
     </w:p>
     <w:p>
       <w:pPr>
-        <w:keepNext/>
-        <w:spacing w:after="0" w:before="160"/>
+        <w:keepNext w:val="0"/>
+        <w:spacing w:after="0" w:before="120"/>
         <w:tabs>
           <w:tab w:val="right" w:leader="underscore" w:pos="9648"/>
         </w:tabs>
@@ -547,21 +523,9 @@
     </w:p>
     <w:p>
       <w:pPr>
-        <w:keepNext w:val="0"/>
-        <w:spacing w:after="0" w:before="160"/>
-        <w:tabs>
-          <w:tab w:val="right" w:leader="underscore" w:pos="9648"/>
-        </w:tabs>
-      </w:pPr>
-      <w:r>
-        <w:tab/>
-      </w:r>
-    </w:p>
-    <w:p>
-      <w:pPr>
         <w:pStyle w:val="Heading2"/>
         <w:keepNext/>
-        <w:spacing w:before="400"/>
+        <w:spacing w:before="200"/>
         <w:pBdr>
           <w:bottom w:val="single" w:sz="12" w:space="4" w:color="5538C9"/>
         </w:pBdr>
@@ -573,7 +537,7 @@
     <w:p>
       <w:pPr>
         <w:keepNext/>
-        <w:spacing w:before="120" w:after="40"/>
+        <w:spacing w:before="60" w:after="20"/>
       </w:pPr>
       <w:r>
         <w:rPr>
@@ -591,7 +555,7 @@
         </w:numPr>
         <w:pStyle w:val="ListNumber"/>
         <w:keepNext/>
-        <w:spacing w:after="40"/>
+        <w:spacing w:after="0"/>
       </w:pPr>
       <w:r>
         <w:t>Make sure Alex is selected and has not voted yet.</w:t>
@@ -605,7 +569,7 @@
         </w:numPr>
         <w:pStyle w:val="ListNumber"/>
         <w:keepNext/>
-        <w:spacing w:after="40"/>
+        <w:spacing w:after="0"/>
       </w:pPr>
       <w:r>
         <w:t>Open the My Vote tab.</w:t>
@@ -619,7 +583,7 @@
         </w:numPr>
         <w:pStyle w:val="ListNumber"/>
         <w:keepNext/>
-        <w:spacing w:after="40"/>
+        <w:spacing w:after="0"/>
       </w:pPr>
       <w:r>
         <w:t>Press the Pick a movie button.</w:t>
@@ -628,7 +592,7 @@
     <w:p>
       <w:pPr>
         <w:keepNext/>
-        <w:spacing w:before="120" w:after="40"/>
+        <w:spacing w:before="60" w:after="20"/>
       </w:pPr>
       <w:r>
         <w:rPr>
@@ -642,7 +606,7 @@
       <w:pPr>
         <w:pStyle w:val="ListBullet"/>
         <w:keepNext/>
-        <w:spacing w:after="40"/>
+        <w:spacing w:after="0"/>
       </w:pPr>
       <w:r>
         <w:t>The page says Alex has not voted yet.</w:t>
@@ -652,7 +616,7 @@
       <w:pPr>
         <w:pStyle w:val="ListBullet"/>
         <w:keepNext/>
-        <w:spacing w:after="40"/>
+        <w:spacing w:after="0"/>
       </w:pPr>
       <w:r>
         <w:t>Pressing Pick a movie opens the Movies tab so a movie can be chosen.</w:t>
@@ -661,7 +625,7 @@
     <w:p>
       <w:pPr>
         <w:keepNext/>
-        <w:spacing w:before="160" w:after="120"/>
+        <w:spacing w:before="80" w:after="40"/>
       </w:pPr>
       <w:r>
         <w:rPr>
@@ -692,7 +656,7 @@
     <w:p>
       <w:pPr>
         <w:keepNext/>
-        <w:spacing w:after="0" w:before="160"/>
+        <w:spacing w:after="0" w:before="120"/>
         <w:tabs>
           <w:tab w:val="right" w:leader="underscore" w:pos="9648"/>
         </w:tabs>
@@ -703,8 +667,8 @@
     </w:p>
     <w:p>
       <w:pPr>
-        <w:keepNext/>
-        <w:spacing w:after="0" w:before="160"/>
+        <w:keepNext w:val="0"/>
+        <w:spacing w:after="0" w:before="120"/>
         <w:tabs>
           <w:tab w:val="right" w:leader="underscore" w:pos="9648"/>
         </w:tabs>
@@ -715,21 +679,9 @@
     </w:p>
     <w:p>
       <w:pPr>
-        <w:keepNext w:val="0"/>
-        <w:spacing w:after="0" w:before="160"/>
-        <w:tabs>
-          <w:tab w:val="right" w:leader="underscore" w:pos="9648"/>
-        </w:tabs>
-      </w:pPr>
-      <w:r>
-        <w:tab/>
-      </w:r>
-    </w:p>
-    <w:p>
-      <w:pPr>
         <w:pStyle w:val="Heading2"/>
         <w:keepNext/>
-        <w:spacing w:before="400"/>
+        <w:spacing w:before="200"/>
         <w:pBdr>
           <w:bottom w:val="single" w:sz="12" w:space="4" w:color="5538C9"/>
         </w:pBdr>
@@ -741,7 +693,7 @@
     <w:p>
       <w:pPr>
         <w:keepNext/>
-        <w:spacing w:before="120" w:after="40"/>
+        <w:spacing w:before="60" w:after="20"/>
       </w:pPr>
       <w:r>
         <w:rPr>
@@ -759,7 +711,7 @@
         </w:numPr>
         <w:pStyle w:val="ListNumber"/>
         <w:keepNext/>
-        <w:spacing w:after="40"/>
+        <w:spacing w:after="0"/>
       </w:pPr>
       <w:r>
         <w:t>On the Movies tab, press Vote for this movie on Galaxy Explorers.</w:t>
@@ -773,7 +725,7 @@
         </w:numPr>
         <w:pStyle w:val="ListNumber"/>
         <w:keepNext/>
-        <w:spacing w:after="40"/>
+        <w:spacing w:after="0"/>
       </w:pPr>
       <w:r>
         <w:t>Open the My Vote tab.</w:t>
@@ -782,7 +734,7 @@
     <w:p>
       <w:pPr>
         <w:keepNext/>
-        <w:spacing w:before="120" w:after="40"/>
+        <w:spacing w:before="60" w:after="20"/>
       </w:pPr>
       <w:r>
         <w:rPr>
@@ -796,7 +748,7 @@
       <w:pPr>
         <w:pStyle w:val="ListBullet"/>
         <w:keepNext/>
-        <w:spacing w:after="40"/>
+        <w:spacing w:after="0"/>
       </w:pPr>
       <w:r>
         <w:t>A message confirms the vote, for example “You voted for Galaxy Explorers!”</w:t>
@@ -806,7 +758,7 @@
       <w:pPr>
         <w:pStyle w:val="ListBullet"/>
         <w:keepNext/>
-        <w:spacing w:after="40"/>
+        <w:spacing w:after="0"/>
       </w:pPr>
       <w:r>
         <w:t>The Galaxy Explorers card is marked as your vote.</w:t>
@@ -816,7 +768,7 @@
       <w:pPr>
         <w:pStyle w:val="ListBullet"/>
         <w:keepNext/>
-        <w:spacing w:after="40"/>
+        <w:spacing w:after="0"/>
       </w:pPr>
       <w:r>
         <w:t>The My Vote tab shows Galaxy Explorers as Alex’s current choice.</w:t>
@@ -825,7 +777,7 @@
     <w:p>
       <w:pPr>
         <w:keepNext/>
-        <w:spacing w:before="160" w:after="120"/>
+        <w:spacing w:before="80" w:after="40"/>
       </w:pPr>
       <w:r>
         <w:rPr>
@@ -856,7 +808,7 @@
     <w:p>
       <w:pPr>
         <w:keepNext/>
-        <w:spacing w:after="0" w:before="160"/>
+        <w:spacing w:after="0" w:before="120"/>
         <w:tabs>
           <w:tab w:val="right" w:leader="underscore" w:pos="9648"/>
         </w:tabs>
@@ -867,8 +819,8 @@
     </w:p>
     <w:p>
       <w:pPr>
-        <w:keepNext/>
-        <w:spacing w:after="0" w:before="160"/>
+        <w:keepNext w:val="0"/>
+        <w:spacing w:after="0" w:before="120"/>
         <w:tabs>
           <w:tab w:val="right" w:leader="underscore" w:pos="9648"/>
         </w:tabs>
@@ -879,21 +831,9 @@
     </w:p>
     <w:p>
       <w:pPr>
-        <w:keepNext w:val="0"/>
-        <w:spacing w:after="0" w:before="160"/>
-        <w:tabs>
-          <w:tab w:val="right" w:leader="underscore" w:pos="9648"/>
-        </w:tabs>
-      </w:pPr>
-      <w:r>
-        <w:tab/>
-      </w:r>
-    </w:p>
-    <w:p>
-      <w:pPr>
         <w:pStyle w:val="Heading2"/>
         <w:keepNext/>
-        <w:spacing w:before="400"/>
+        <w:spacing w:before="200"/>
         <w:pBdr>
           <w:bottom w:val="single" w:sz="12" w:space="4" w:color="5538C9"/>
         </w:pBdr>
@@ -905,7 +845,7 @@
     <w:p>
       <w:pPr>
         <w:keepNext/>
-        <w:spacing w:before="120" w:after="40"/>
+        <w:spacing w:before="60" w:after="20"/>
       </w:pPr>
       <w:r>
         <w:rPr>
@@ -923,7 +863,7 @@
         </w:numPr>
         <w:pStyle w:val="ListNumber"/>
         <w:keepNext/>
-        <w:spacing w:after="40"/>
+        <w:spacing w:after="0"/>
       </w:pPr>
       <w:r>
         <w:t>Go back to the Movies tab.</w:t>
@@ -937,7 +877,7 @@
         </w:numPr>
         <w:pStyle w:val="ListNumber"/>
         <w:keepNext/>
-        <w:spacing w:after="40"/>
+        <w:spacing w:after="0"/>
       </w:pPr>
       <w:r>
         <w:t>Press Vote for this movie on The Last Dragon Egg.</w:t>
@@ -951,7 +891,7 @@
         </w:numPr>
         <w:pStyle w:val="ListNumber"/>
         <w:keepNext/>
-        <w:spacing w:after="40"/>
+        <w:spacing w:after="0"/>
       </w:pPr>
       <w:r>
         <w:t>Open the My Vote tab.</w:t>
@@ -960,7 +900,7 @@
     <w:p>
       <w:pPr>
         <w:keepNext/>
-        <w:spacing w:before="120" w:after="40"/>
+        <w:spacing w:before="60" w:after="20"/>
       </w:pPr>
       <w:r>
         <w:rPr>
@@ -974,7 +914,7 @@
       <w:pPr>
         <w:pStyle w:val="ListBullet"/>
         <w:keepNext/>
-        <w:spacing w:after="40"/>
+        <w:spacing w:after="0"/>
       </w:pPr>
       <w:r>
         <w:t>A message confirms that the vote was changed, for example “Your vote was changed to The Last Dragon Egg!”</w:t>
@@ -984,7 +924,7 @@
       <w:pPr>
         <w:pStyle w:val="ListBullet"/>
         <w:keepNext/>
-        <w:spacing w:after="40"/>
+        <w:spacing w:after="0"/>
       </w:pPr>
       <w:r>
         <w:t>Only The Last Dragon Egg is marked as your vote. Galaxy Explorers is no longer marked.</w:t>
@@ -994,7 +934,7 @@
       <w:pPr>
         <w:pStyle w:val="ListBullet"/>
         <w:keepNext/>
-        <w:spacing w:after="40"/>
+        <w:spacing w:after="0"/>
       </w:pPr>
       <w:r>
         <w:t>The My Vote tab shows The Last Dragon Egg.</w:t>
@@ -1003,7 +943,7 @@
     <w:p>
       <w:pPr>
         <w:keepNext/>
-        <w:spacing w:before="160" w:after="120"/>
+        <w:spacing w:before="80" w:after="40"/>
       </w:pPr>
       <w:r>
         <w:rPr>
@@ -1034,7 +974,7 @@
     <w:p>
       <w:pPr>
         <w:keepNext/>
-        <w:spacing w:after="0" w:before="160"/>
+        <w:spacing w:after="0" w:before="120"/>
         <w:tabs>
           <w:tab w:val="right" w:leader="underscore" w:pos="9648"/>
         </w:tabs>
@@ -1045,8 +985,8 @@
     </w:p>
     <w:p>
       <w:pPr>
-        <w:keepNext/>
-        <w:spacing w:after="0" w:before="160"/>
+        <w:keepNext w:val="0"/>
+        <w:spacing w:after="0" w:before="120"/>
         <w:tabs>
           <w:tab w:val="right" w:leader="underscore" w:pos="9648"/>
         </w:tabs>
@@ -1057,21 +997,9 @@
     </w:p>
     <w:p>
       <w:pPr>
-        <w:keepNext w:val="0"/>
-        <w:spacing w:after="0" w:before="160"/>
-        <w:tabs>
-          <w:tab w:val="right" w:leader="underscore" w:pos="9648"/>
-        </w:tabs>
-      </w:pPr>
-      <w:r>
-        <w:tab/>
-      </w:r>
-    </w:p>
-    <w:p>
-      <w:pPr>
         <w:pStyle w:val="Heading2"/>
         <w:keepNext/>
-        <w:spacing w:before="400"/>
+        <w:spacing w:before="200"/>
         <w:pBdr>
           <w:bottom w:val="single" w:sz="12" w:space="4" w:color="5538C9"/>
         </w:pBdr>
@@ -1083,7 +1011,7 @@
     <w:p>
       <w:pPr>
         <w:keepNext/>
-        <w:spacing w:before="120" w:after="40"/>
+        <w:spacing w:before="60" w:after="20"/>
       </w:pPr>
       <w:r>
         <w:rPr>
@@ -1101,7 +1029,7 @@
         </w:numPr>
         <w:pStyle w:val="ListNumber"/>
         <w:keepNext/>
-        <w:spacing w:after="40"/>
+        <w:spacing w:after="0"/>
       </w:pPr>
       <w:r>
         <w:t>Open the Results tab while voting is still open.</w:t>
@@ -1110,7 +1038,7 @@
     <w:p>
       <w:pPr>
         <w:keepNext/>
-        <w:spacing w:before="120" w:after="40"/>
+        <w:spacing w:before="60" w:after="20"/>
       </w:pPr>
       <w:r>
         <w:rPr>
@@ -1124,7 +1052,7 @@
       <w:pPr>
         <w:pStyle w:val="ListBullet"/>
         <w:keepNext/>
-        <w:spacing w:after="40"/>
+        <w:spacing w:after="0"/>
       </w:pPr>
       <w:r>
         <w:t>No vote counts are shown and no winner is shown.</w:t>
@@ -1134,7 +1062,7 @@
       <w:pPr>
         <w:pStyle w:val="ListBullet"/>
         <w:keepNext/>
-        <w:spacing w:after="40"/>
+        <w:spacing w:after="0"/>
       </w:pPr>
       <w:r>
         <w:t>A message explains that results are hidden until the teacher closes voting.</w:t>
@@ -1143,7 +1071,7 @@
     <w:p>
       <w:pPr>
         <w:keepNext/>
-        <w:spacing w:before="160" w:after="120"/>
+        <w:spacing w:before="80" w:after="40"/>
       </w:pPr>
       <w:r>
         <w:rPr>
@@ -1174,7 +1102,7 @@
     <w:p>
       <w:pPr>
         <w:keepNext/>
-        <w:spacing w:after="0" w:before="160"/>
+        <w:spacing w:after="0" w:before="120"/>
         <w:tabs>
           <w:tab w:val="right" w:leader="underscore" w:pos="9648"/>
         </w:tabs>
@@ -1185,8 +1113,8 @@
     </w:p>
     <w:p>
       <w:pPr>
-        <w:keepNext/>
-        <w:spacing w:after="0" w:before="160"/>
+        <w:keepNext w:val="0"/>
+        <w:spacing w:after="0" w:before="120"/>
         <w:tabs>
           <w:tab w:val="right" w:leader="underscore" w:pos="9648"/>
         </w:tabs>
@@ -1197,21 +1125,9 @@
     </w:p>
     <w:p>
       <w:pPr>
-        <w:keepNext w:val="0"/>
-        <w:spacing w:after="0" w:before="160"/>
-        <w:tabs>
-          <w:tab w:val="right" w:leader="underscore" w:pos="9648"/>
-        </w:tabs>
-      </w:pPr>
-      <w:r>
-        <w:tab/>
-      </w:r>
-    </w:p>
-    <w:p>
-      <w:pPr>
         <w:pStyle w:val="Heading2"/>
         <w:keepNext/>
-        <w:spacing w:before="400"/>
+        <w:spacing w:before="200"/>
         <w:pBdr>
           <w:bottom w:val="single" w:sz="12" w:space="4" w:color="5538C9"/>
         </w:pBdr>
@@ -1223,7 +1139,7 @@
     <w:p>
       <w:pPr>
         <w:keepNext/>
-        <w:spacing w:before="120" w:after="40"/>
+        <w:spacing w:before="60" w:after="20"/>
       </w:pPr>
       <w:r>
         <w:rPr>
@@ -1241,7 +1157,7 @@
         </w:numPr>
         <w:pStyle w:val="ListNumber"/>
         <w:keepNext/>
-        <w:spacing w:after="40"/>
+        <w:spacing w:after="0"/>
       </w:pPr>
       <w:r>
         <w:t>Open the Teacher tab and enter the PIN 1234.</w:t>
@@ -1255,7 +1171,7 @@
         </w:numPr>
         <w:pStyle w:val="ListNumber"/>
         <w:keepNext/>
-        <w:spacing w:after="40"/>
+        <w:spacing w:after="0"/>
       </w:pPr>
       <w:r>
         <w:t>Look at the “Who has voted?” section.</w:t>
@@ -1264,7 +1180,7 @@
     <w:p>
       <w:pPr>
         <w:keepNext/>
-        <w:spacing w:before="120" w:after="40"/>
+        <w:spacing w:before="60" w:after="20"/>
       </w:pPr>
       <w:r>
         <w:rPr>
@@ -1278,7 +1194,7 @@
       <w:pPr>
         <w:pStyle w:val="ListBullet"/>
         <w:keepNext/>
-        <w:spacing w:after="40"/>
+        <w:spacing w:after="0"/>
       </w:pPr>
       <w:r>
         <w:t>The teacher can see that voting is open.</w:t>
@@ -1288,7 +1204,7 @@
       <w:pPr>
         <w:pStyle w:val="ListBullet"/>
         <w:keepNext/>
-        <w:spacing w:after="40"/>
+        <w:spacing w:after="0"/>
       </w:pPr>
       <w:r>
         <w:t>It shows 1 student has voted and 5 have not voted. The two numbers add up to 6, the number of students.</w:t>
@@ -1298,7 +1214,7 @@
       <w:pPr>
         <w:pStyle w:val="ListBullet"/>
         <w:keepNext/>
-        <w:spacing w:after="40"/>
+        <w:spacing w:after="0"/>
       </w:pPr>
       <w:r>
         <w:t>The teacher cannot see which movie Alex picked.</w:t>
@@ -1307,7 +1223,7 @@
     <w:p>
       <w:pPr>
         <w:keepNext/>
-        <w:spacing w:before="160" w:after="120"/>
+        <w:spacing w:before="80" w:after="40"/>
       </w:pPr>
       <w:r>
         <w:rPr>
@@ -1338,7 +1254,7 @@
     <w:p>
       <w:pPr>
         <w:keepNext/>
-        <w:spacing w:after="0" w:before="160"/>
+        <w:spacing w:after="0" w:before="120"/>
         <w:tabs>
           <w:tab w:val="right" w:leader="underscore" w:pos="9648"/>
         </w:tabs>
@@ -1349,8 +1265,8 @@
     </w:p>
     <w:p>
       <w:pPr>
-        <w:keepNext/>
-        <w:spacing w:after="0" w:before="160"/>
+        <w:keepNext w:val="0"/>
+        <w:spacing w:after="0" w:before="120"/>
         <w:tabs>
           <w:tab w:val="right" w:leader="underscore" w:pos="9648"/>
         </w:tabs>
@@ -1361,21 +1277,9 @@
     </w:p>
     <w:p>
       <w:pPr>
-        <w:keepNext w:val="0"/>
-        <w:spacing w:after="0" w:before="160"/>
-        <w:tabs>
-          <w:tab w:val="right" w:leader="underscore" w:pos="9648"/>
-        </w:tabs>
-      </w:pPr>
-      <w:r>
-        <w:tab/>
-      </w:r>
-    </w:p>
-    <w:p>
-      <w:pPr>
         <w:pStyle w:val="Heading2"/>
         <w:keepNext/>
-        <w:spacing w:before="400"/>
+        <w:spacing w:before="200"/>
         <w:pBdr>
           <w:bottom w:val="single" w:sz="12" w:space="4" w:color="5538C9"/>
         </w:pBdr>
@@ -1387,7 +1291,7 @@
     <w:p>
       <w:pPr>
         <w:keepNext/>
-        <w:spacing w:before="120" w:after="40"/>
+        <w:spacing w:before="60" w:after="20"/>
       </w:pPr>
       <w:r>
         <w:rPr>
@@ -1405,7 +1309,7 @@
         </w:numPr>
         <w:pStyle w:val="ListNumber"/>
         <w:keepNext/>
-        <w:spacing w:after="40"/>
+        <w:spacing w:after="0"/>
       </w:pPr>
       <w:r>
         <w:t>On the Teacher tab, press Close voting.</w:t>
@@ -1419,7 +1323,7 @@
         </w:numPr>
         <w:pStyle w:val="ListNumber"/>
         <w:keepNext/>
-        <w:spacing w:after="40"/>
+        <w:spacing w:after="0"/>
       </w:pPr>
       <w:r>
         <w:t>Look at the top of the page, then open the Movies tab and try to vote.</w:t>
@@ -1433,7 +1337,7 @@
         </w:numPr>
         <w:pStyle w:val="ListNumber"/>
         <w:keepNext/>
-        <w:spacing w:after="40"/>
+        <w:spacing w:after="0"/>
       </w:pPr>
       <w:r>
         <w:t>Open the Results tab.</w:t>
@@ -1442,7 +1346,7 @@
     <w:p>
       <w:pPr>
         <w:keepNext/>
-        <w:spacing w:before="120" w:after="40"/>
+        <w:spacing w:before="60" w:after="20"/>
       </w:pPr>
       <w:r>
         <w:rPr>
@@ -1456,7 +1360,7 @@
       <w:pPr>
         <w:pStyle w:val="ListBullet"/>
         <w:keepNext/>
-        <w:spacing w:after="40"/>
+        <w:spacing w:after="0"/>
       </w:pPr>
       <w:r>
         <w:t>The status at the top changes to “Voting is CLOSED” and turns from green to red.</w:t>
@@ -1466,7 +1370,7 @@
       <w:pPr>
         <w:pStyle w:val="ListBullet"/>
         <w:keepNext/>
-        <w:spacing w:after="40"/>
+        <w:spacing w:after="0"/>
       </w:pPr>
       <w:r>
         <w:t>The Movies tab explains that voting is closed and the vote buttons cannot be used.</w:t>
@@ -1476,7 +1380,7 @@
       <w:pPr>
         <w:pStyle w:val="ListBullet"/>
         <w:keepNext/>
-        <w:spacing w:after="40"/>
+        <w:spacing w:after="0"/>
       </w:pPr>
       <w:r>
         <w:t>The Results tab now shows a vote count for all six movies, including the ones with 0 votes, and names The Last Dragon Egg as the winner.</w:t>
@@ -1485,7 +1389,7 @@
     <w:p>
       <w:pPr>
         <w:keepNext/>
-        <w:spacing w:before="160" w:after="120"/>
+        <w:spacing w:before="80" w:after="40"/>
       </w:pPr>
       <w:r>
         <w:rPr>
@@ -1516,7 +1420,7 @@
     <w:p>
       <w:pPr>
         <w:keepNext/>
-        <w:spacing w:after="0" w:before="160"/>
+        <w:spacing w:after="0" w:before="120"/>
         <w:tabs>
           <w:tab w:val="right" w:leader="underscore" w:pos="9648"/>
         </w:tabs>
@@ -1527,8 +1431,8 @@
     </w:p>
     <w:p>
       <w:pPr>
-        <w:keepNext/>
-        <w:spacing w:after="0" w:before="160"/>
+        <w:keepNext w:val="0"/>
+        <w:spacing w:after="0" w:before="120"/>
         <w:tabs>
           <w:tab w:val="right" w:leader="underscore" w:pos="9648"/>
         </w:tabs>
@@ -1539,21 +1443,9 @@
     </w:p>
     <w:p>
       <w:pPr>
-        <w:keepNext w:val="0"/>
-        <w:spacing w:after="0" w:before="160"/>
-        <w:tabs>
-          <w:tab w:val="right" w:leader="underscore" w:pos="9648"/>
-        </w:tabs>
-      </w:pPr>
-      <w:r>
-        <w:tab/>
-      </w:r>
-    </w:p>
-    <w:p>
-      <w:pPr>
         <w:pStyle w:val="Heading2"/>
         <w:keepNext/>
-        <w:spacing w:before="400"/>
+        <w:spacing w:before="200"/>
         <w:pBdr>
           <w:bottom w:val="single" w:sz="12" w:space="4" w:color="5538C9"/>
         </w:pBdr>
@@ -1565,7 +1457,7 @@
     <w:p>
       <w:pPr>
         <w:keepNext/>
-        <w:spacing w:before="120" w:after="40"/>
+        <w:spacing w:before="60" w:after="20"/>
       </w:pPr>
       <w:r>
         <w:rPr>
@@ -1583,7 +1475,7 @@
         </w:numPr>
         <w:pStyle w:val="ListNumber"/>
         <w:keepNext/>
-        <w:spacing w:after="40"/>
+        <w:spacing w:after="0"/>
       </w:pPr>
       <w:r>
         <w:t>Open the Teacher tab.</w:t>
@@ -1597,7 +1489,7 @@
         </w:numPr>
         <w:pStyle w:val="ListNumber"/>
         <w:keepNext/>
-        <w:spacing w:after="40"/>
+        <w:spacing w:after="0"/>
       </w:pPr>
       <w:r>
         <w:t>Press Reset all votes.</w:t>
@@ -1611,7 +1503,7 @@
         </w:numPr>
         <w:pStyle w:val="ListNumber"/>
         <w:keepNext/>
-        <w:spacing w:after="40"/>
+        <w:spacing w:after="0"/>
       </w:pPr>
       <w:r>
         <w:t>Press Cancel on the confirmation. Then press Reset all votes again and confirm.</w:t>
@@ -1625,7 +1517,7 @@
         </w:numPr>
         <w:pStyle w:val="ListNumber"/>
         <w:keepNext/>
-        <w:spacing w:after="40"/>
+        <w:spacing w:after="0"/>
       </w:pPr>
       <w:r>
         <w:t>Check the Teacher counts, then open the My Vote tab.</w:t>
@@ -1634,7 +1526,7 @@
     <w:p>
       <w:pPr>
         <w:keepNext/>
-        <w:spacing w:before="120" w:after="40"/>
+        <w:spacing w:before="60" w:after="20"/>
       </w:pPr>
       <w:r>
         <w:rPr>
@@ -1648,7 +1540,7 @@
       <w:pPr>
         <w:pStyle w:val="ListBullet"/>
         <w:keepNext/>
-        <w:spacing w:after="40"/>
+        <w:spacing w:after="0"/>
       </w:pPr>
       <w:r>
         <w:t>A confirmation box appears before anything is reset. Cancelling changes nothing.</w:t>
@@ -1658,7 +1550,7 @@
       <w:pPr>
         <w:pStyle w:val="ListBullet"/>
         <w:keepNext/>
-        <w:spacing w:after="40"/>
+        <w:spacing w:after="0"/>
       </w:pPr>
       <w:r>
         <w:t>After confirming, a message says all votes were reset.</w:t>
@@ -1668,7 +1560,7 @@
       <w:pPr>
         <w:pStyle w:val="ListBullet"/>
         <w:keepNext/>
-        <w:spacing w:after="40"/>
+        <w:spacing w:after="0"/>
       </w:pPr>
       <w:r>
         <w:t>Voting is open again, 0 students have voted, 6 have not voted.</w:t>
@@ -1678,7 +1570,7 @@
       <w:pPr>
         <w:pStyle w:val="ListBullet"/>
         <w:keepNext/>
-        <w:spacing w:after="40"/>
+        <w:spacing w:after="0"/>
       </w:pPr>
       <w:r>
         <w:t>The My Vote tab shows Alex has not voted yet.</w:t>
@@ -1688,7 +1580,7 @@
       <w:pPr>
         <w:pStyle w:val="ListBullet"/>
         <w:keepNext/>
-        <w:spacing w:after="40"/>
+        <w:spacing w:after="0"/>
       </w:pPr>
       <w:r>
         <w:t>The student list and movie list are unchanged.</w:t>
@@ -1697,7 +1589,7 @@
     <w:p>
       <w:pPr>
         <w:keepNext/>
-        <w:spacing w:before="160" w:after="120"/>
+        <w:spacing w:before="80" w:after="40"/>
       </w:pPr>
       <w:r>
         <w:rPr>
@@ -1728,7 +1620,7 @@
     <w:p>
       <w:pPr>
         <w:keepNext/>
-        <w:spacing w:after="0" w:before="160"/>
+        <w:spacing w:after="0" w:before="120"/>
         <w:tabs>
           <w:tab w:val="right" w:leader="underscore" w:pos="9648"/>
         </w:tabs>
@@ -1739,20 +1631,8 @@
     </w:p>
     <w:p>
       <w:pPr>
-        <w:keepNext/>
-        <w:spacing w:after="0" w:before="160"/>
-        <w:tabs>
-          <w:tab w:val="right" w:leader="underscore" w:pos="9648"/>
-        </w:tabs>
-      </w:pPr>
-      <w:r>
-        <w:tab/>
-      </w:r>
-    </w:p>
-    <w:p>
-      <w:pPr>
         <w:keepNext w:val="0"/>
-        <w:spacing w:after="0" w:before="160"/>
+        <w:spacing w:after="0" w:before="120"/>
         <w:tabs>
           <w:tab w:val="right" w:leader="underscore" w:pos="9648"/>
         </w:tabs>
@@ -1763,7 +1643,7 @@
     </w:p>
     <w:sectPr>
       <w:pgSz w:w="12240" w:h="15840"/>
-      <w:pgMar w:top="1080" w:right="1296" w:bottom="1080" w:left="1296" w:header="720" w:footer="720" w:gutter="0"/>
+      <w:pgMar w:top="864" w:right="1296" w:bottom="864" w:left="1296" w:header="720" w:footer="720" w:gutter="0"/>
       <w:cols w:space="720"/>
       <w:docGrid w:linePitch="360"/>
     </w:sectPr>
@@ -2199,7 +2079,7 @@
     </w:pPr>
     <w:rPr>
       <w:rFonts w:ascii="Calibri" w:hAnsi="Calibri" w:eastAsia="Calibri"/>
-      <w:sz w:val="22"/>
+      <w:sz w:val="21"/>
     </w:rPr>
   </w:style>
   <w:style w:type="paragraph" w:styleId="Header">
@@ -2265,7 +2145,7 @@
       <w:b/>
       <w:bCs/>
       <w:color w:val="5538C9"/>
-      <w:sz w:val="30"/>
+      <w:sz w:val="28"/>
       <w:szCs w:val="28"/>
     </w:rPr>
   </w:style>
@@ -2289,7 +2169,7 @@
       <w:b/>
       <w:bCs/>
       <w:color w:val="2B2B3D"/>
-      <w:sz w:val="28"/>
+      <w:sz w:val="25"/>
       <w:szCs w:val="26"/>
     </w:rPr>
   </w:style>
@@ -2555,7 +2435,7 @@
       <w:color w:val="5538C9"/>
       <w:spacing w:val="5"/>
       <w:kern w:val="28"/>
-      <w:sz w:val="48"/>
+      <w:sz w:val="44"/>
       <w:szCs w:val="52"/>
     </w:rPr>
   </w:style>

</xml_diff>